<commit_message>
docs:update JDBC integrate new db with weblogic after 19.3 database upgrade
</commit_message>
<xml_diff>
--- a/docs/5_Update JDBC after database upgrade.docx
+++ b/docs/5_Update JDBC after database upgrade.docx
@@ -4,16 +4,107 @@
   <w:body>
     <w:p>
       <w:r>
+        <w:rPr>
+          <w:highlight w:val="yellow"/>
+        </w:rPr>
         <w:t>Update JDBC after database upgrade.</w:t>
       </w:r>
     </w:p>
     <w:p>
       <w:r>
+        <w:t xml:space="preserve">-Edit data source file and change </w:t>
+      </w:r>
+      <w:proofErr w:type="spellStart"/>
+      <w:r>
+        <w:t>url</w:t>
+      </w:r>
+      <w:proofErr w:type="spellEnd"/>
+      <w:r>
+        <w:t xml:space="preserve"> tinacloud12c to </w:t>
+      </w:r>
+      <w:proofErr w:type="spellStart"/>
+      <w:r>
+        <w:t>tinacloud</w:t>
+      </w:r>
+      <w:proofErr w:type="spellEnd"/>
+    </w:p>
+    <w:p>
+      <w:r>
+        <w:t xml:space="preserve">-Delete </w:t>
+      </w:r>
+      <w:r>
+        <w:t>WebLogic temporary files</w:t>
+      </w:r>
+      <w:r>
+        <w:t xml:space="preserve"> so </w:t>
+      </w:r>
+      <w:r>
+        <w:t>WebLogic</w:t>
+      </w:r>
+      <w:r>
+        <w:t xml:space="preserve"> </w:t>
+      </w:r>
+      <w:proofErr w:type="gramStart"/>
+      <w:r>
+        <w:t xml:space="preserve">will  </w:t>
+      </w:r>
+      <w:r>
+        <w:t>start</w:t>
+      </w:r>
+      <w:proofErr w:type="gramEnd"/>
+      <w:r>
+        <w:t xml:space="preserve"> fresh and regenerate its temporary files from the </w:t>
+      </w:r>
+      <w:r>
+        <w:rPr>
+          <w:b/>
+          <w:bCs/>
+        </w:rPr>
+        <w:t>current</w:t>
+      </w:r>
+      <w:r>
+        <w:t xml:space="preserve"> </w:t>
+      </w:r>
+      <w:proofErr w:type="spellStart"/>
+      <w:r>
+        <w:t>datasource</w:t>
+      </w:r>
+      <w:proofErr w:type="spellEnd"/>
+      <w:r>
+        <w:t xml:space="preserve"> configuration</w:t>
+      </w:r>
+      <w:r>
+        <w:t xml:space="preserve"> using the new </w:t>
+      </w:r>
+      <w:proofErr w:type="spellStart"/>
+      <w:r>
+        <w:t>url</w:t>
+      </w:r>
+      <w:proofErr w:type="spellEnd"/>
+      <w:r>
+        <w:t xml:space="preserve"> path</w:t>
+      </w:r>
+    </w:p>
+    <w:p>
+      <w:r>
+        <w:t xml:space="preserve">-start </w:t>
+      </w:r>
+      <w:proofErr w:type="spellStart"/>
+      <w:r>
+        <w:t>nodemanger</w:t>
+      </w:r>
+      <w:proofErr w:type="spellEnd"/>
+    </w:p>
+    <w:p>
+      <w:r>
+        <w:rPr>
+          <w:noProof/>
+        </w:rPr>
         <w:drawing>
-          <wp:inline distT="0" distB="0" distL="0" distR="0" wp14:anchorId="31D8EFAB" wp14:editId="20BE2DBD">
-            <wp:extent cx="5943600" cy="3928110"/>
+          <wp:inline distT="0" distB="0" distL="0" distR="0" wp14:anchorId="65782ECC" wp14:editId="4E925F35">
+            <wp:extent cx="5943600" cy="4671060"/>
             <wp:effectExtent l="0" t="0" r="0" b="0"/>
-            <wp:docPr id="85108426" name="Picture 1"/>
+            <wp:docPr id="902737089" name="Picture 1"/>
             <wp:cNvGraphicFramePr>
               <a:graphicFrameLocks xmlns:a="http://schemas.openxmlformats.org/drawingml/2006/main" noChangeAspect="1"/>
             </wp:cNvGraphicFramePr>
@@ -21,7 +112,7 @@
               <a:graphicData uri="http://schemas.openxmlformats.org/drawingml/2006/picture">
                 <pic:pic xmlns:pic="http://schemas.openxmlformats.org/drawingml/2006/picture">
                   <pic:nvPicPr>
-                    <pic:cNvPr id="85108426" name=""/>
+                    <pic:cNvPr id="902737089" name=""/>
                     <pic:cNvPicPr/>
                   </pic:nvPicPr>
                   <pic:blipFill>
@@ -33,7 +124,7 @@
                   <pic:spPr>
                     <a:xfrm>
                       <a:off x="0" y="0"/>
-                      <a:ext cx="5943600" cy="3928110"/>
+                      <a:ext cx="5943600" cy="4671060"/>
                     </a:xfrm>
                     <a:prstGeom prst="rect">
                       <a:avLst/>
@@ -48,6 +139,52 @@
     </w:p>
     <w:p>
       <w:r>
+        <w:rPr>
+          <w:noProof/>
+        </w:rPr>
+        <w:drawing>
+          <wp:inline distT="0" distB="0" distL="0" distR="0" wp14:anchorId="69C89EDD" wp14:editId="662B9717">
+            <wp:extent cx="5943600" cy="1062355"/>
+            <wp:effectExtent l="0" t="0" r="0" b="4445"/>
+            <wp:docPr id="1606887224" name="Picture 1"/>
+            <wp:cNvGraphicFramePr>
+              <a:graphicFrameLocks xmlns:a="http://schemas.openxmlformats.org/drawingml/2006/main" noChangeAspect="1"/>
+            </wp:cNvGraphicFramePr>
+            <a:graphic xmlns:a="http://schemas.openxmlformats.org/drawingml/2006/main">
+              <a:graphicData uri="http://schemas.openxmlformats.org/drawingml/2006/picture">
+                <pic:pic xmlns:pic="http://schemas.openxmlformats.org/drawingml/2006/picture">
+                  <pic:nvPicPr>
+                    <pic:cNvPr id="1606887224" name=""/>
+                    <pic:cNvPicPr/>
+                  </pic:nvPicPr>
+                  <pic:blipFill>
+                    <a:blip r:embed="rId5"/>
+                    <a:stretch>
+                      <a:fillRect/>
+                    </a:stretch>
+                  </pic:blipFill>
+                  <pic:spPr>
+                    <a:xfrm>
+                      <a:off x="0" y="0"/>
+                      <a:ext cx="5943600" cy="1062355"/>
+                    </a:xfrm>
+                    <a:prstGeom prst="rect">
+                      <a:avLst/>
+                    </a:prstGeom>
+                  </pic:spPr>
+                </pic:pic>
+              </a:graphicData>
+            </a:graphic>
+          </wp:inline>
+        </w:drawing>
+      </w:r>
+    </w:p>
+    <w:p/>
+    <w:p>
+      <w:r>
+        <w:rPr>
+          <w:noProof/>
+        </w:rPr>
         <w:lastRenderedPageBreak/>
         <w:drawing>
           <wp:inline distT="0" distB="0" distL="0" distR="0" wp14:anchorId="03079975" wp14:editId="5596D925">
@@ -65,7 +202,7 @@
                     <pic:cNvPicPr/>
                   </pic:nvPicPr>
                   <pic:blipFill>
-                    <a:blip r:embed="rId5"/>
+                    <a:blip r:embed="rId6"/>
                     <a:stretch>
                       <a:fillRect/>
                     </a:stretch>
@@ -88,6 +225,9 @@
     </w:p>
     <w:p>
       <w:r>
+        <w:rPr>
+          <w:noProof/>
+        </w:rPr>
         <w:lastRenderedPageBreak/>
         <w:drawing>
           <wp:inline distT="0" distB="0" distL="0" distR="0" wp14:anchorId="16094E13" wp14:editId="7E04F51B">
@@ -105,7 +245,7 @@
                     <pic:cNvPicPr/>
                   </pic:nvPicPr>
                   <pic:blipFill>
-                    <a:blip r:embed="rId6"/>
+                    <a:blip r:embed="rId7"/>
                     <a:stretch>
                       <a:fillRect/>
                     </a:stretch>
@@ -129,6 +269,117 @@
     <w:p>
       <w:r>
         <w:lastRenderedPageBreak/>
+        <w:t xml:space="preserve">Start </w:t>
+      </w:r>
+      <w:proofErr w:type="spellStart"/>
+      <w:r>
+        <w:t>AdminServer</w:t>
+      </w:r>
+      <w:proofErr w:type="spellEnd"/>
+      <w:r>
+        <w:t>:</w:t>
+      </w:r>
+    </w:p>
+    <w:p>
+      <w:r>
+        <w:rPr>
+          <w:noProof/>
+        </w:rPr>
+        <w:drawing>
+          <wp:inline distT="0" distB="0" distL="0" distR="0" wp14:anchorId="21681879" wp14:editId="30ECBA35">
+            <wp:extent cx="5943600" cy="3439160"/>
+            <wp:effectExtent l="0" t="0" r="0" b="8890"/>
+            <wp:docPr id="1951375144" name="Picture 1"/>
+            <wp:cNvGraphicFramePr>
+              <a:graphicFrameLocks xmlns:a="http://schemas.openxmlformats.org/drawingml/2006/main" noChangeAspect="1"/>
+            </wp:cNvGraphicFramePr>
+            <a:graphic xmlns:a="http://schemas.openxmlformats.org/drawingml/2006/main">
+              <a:graphicData uri="http://schemas.openxmlformats.org/drawingml/2006/picture">
+                <pic:pic xmlns:pic="http://schemas.openxmlformats.org/drawingml/2006/picture">
+                  <pic:nvPicPr>
+                    <pic:cNvPr id="1951375144" name=""/>
+                    <pic:cNvPicPr/>
+                  </pic:nvPicPr>
+                  <pic:blipFill>
+                    <a:blip r:embed="rId8"/>
+                    <a:stretch>
+                      <a:fillRect/>
+                    </a:stretch>
+                  </pic:blipFill>
+                  <pic:spPr>
+                    <a:xfrm>
+                      <a:off x="0" y="0"/>
+                      <a:ext cx="5943600" cy="3439160"/>
+                    </a:xfrm>
+                    <a:prstGeom prst="rect">
+                      <a:avLst/>
+                    </a:prstGeom>
+                  </pic:spPr>
+                </pic:pic>
+              </a:graphicData>
+            </a:graphic>
+          </wp:inline>
+        </w:drawing>
+      </w:r>
+    </w:p>
+    <w:p>
+      <w:r>
+        <w:t xml:space="preserve">Start </w:t>
+      </w:r>
+      <w:proofErr w:type="spellStart"/>
+      <w:r>
+        <w:t>ManagedServer</w:t>
+      </w:r>
+      <w:proofErr w:type="spellEnd"/>
+    </w:p>
+    <w:p>
+      <w:r>
+        <w:rPr>
+          <w:noProof/>
+        </w:rPr>
+        <w:drawing>
+          <wp:inline distT="0" distB="0" distL="0" distR="0" wp14:anchorId="1EB07E8C" wp14:editId="0A08361E">
+            <wp:extent cx="5943600" cy="2802890"/>
+            <wp:effectExtent l="0" t="0" r="0" b="0"/>
+            <wp:docPr id="481628342" name="Picture 1"/>
+            <wp:cNvGraphicFramePr>
+              <a:graphicFrameLocks xmlns:a="http://schemas.openxmlformats.org/drawingml/2006/main" noChangeAspect="1"/>
+            </wp:cNvGraphicFramePr>
+            <a:graphic xmlns:a="http://schemas.openxmlformats.org/drawingml/2006/main">
+              <a:graphicData uri="http://schemas.openxmlformats.org/drawingml/2006/picture">
+                <pic:pic xmlns:pic="http://schemas.openxmlformats.org/drawingml/2006/picture">
+                  <pic:nvPicPr>
+                    <pic:cNvPr id="481628342" name=""/>
+                    <pic:cNvPicPr/>
+                  </pic:nvPicPr>
+                  <pic:blipFill>
+                    <a:blip r:embed="rId9"/>
+                    <a:stretch>
+                      <a:fillRect/>
+                    </a:stretch>
+                  </pic:blipFill>
+                  <pic:spPr>
+                    <a:xfrm>
+                      <a:off x="0" y="0"/>
+                      <a:ext cx="5943600" cy="2802890"/>
+                    </a:xfrm>
+                    <a:prstGeom prst="rect">
+                      <a:avLst/>
+                    </a:prstGeom>
+                  </pic:spPr>
+                </pic:pic>
+              </a:graphicData>
+            </a:graphic>
+          </wp:inline>
+        </w:drawing>
+      </w:r>
+    </w:p>
+    <w:p>
+      <w:r>
+        <w:rPr>
+          <w:noProof/>
+        </w:rPr>
+        <w:lastRenderedPageBreak/>
         <w:drawing>
           <wp:inline distT="0" distB="0" distL="0" distR="0" wp14:anchorId="546C007C" wp14:editId="09681657">
             <wp:extent cx="5943600" cy="1749425"/>
@@ -145,7 +396,7 @@
                     <pic:cNvPicPr/>
                   </pic:nvPicPr>
                   <pic:blipFill>
-                    <a:blip r:embed="rId7"/>
+                    <a:blip r:embed="rId10"/>
                     <a:stretch>
                       <a:fillRect/>
                     </a:stretch>
@@ -168,6 +419,51 @@
     </w:p>
     <w:p>
       <w:r>
+        <w:rPr>
+          <w:noProof/>
+        </w:rPr>
+        <w:drawing>
+          <wp:inline distT="0" distB="0" distL="0" distR="0" wp14:anchorId="0BB25F99" wp14:editId="73E583C8">
+            <wp:extent cx="5943600" cy="1603375"/>
+            <wp:effectExtent l="0" t="0" r="0" b="0"/>
+            <wp:docPr id="763336577" name="Picture 1"/>
+            <wp:cNvGraphicFramePr>
+              <a:graphicFrameLocks xmlns:a="http://schemas.openxmlformats.org/drawingml/2006/main" noChangeAspect="1"/>
+            </wp:cNvGraphicFramePr>
+            <a:graphic xmlns:a="http://schemas.openxmlformats.org/drawingml/2006/main">
+              <a:graphicData uri="http://schemas.openxmlformats.org/drawingml/2006/picture">
+                <pic:pic xmlns:pic="http://schemas.openxmlformats.org/drawingml/2006/picture">
+                  <pic:nvPicPr>
+                    <pic:cNvPr id="763336577" name=""/>
+                    <pic:cNvPicPr/>
+                  </pic:nvPicPr>
+                  <pic:blipFill>
+                    <a:blip r:embed="rId11"/>
+                    <a:stretch>
+                      <a:fillRect/>
+                    </a:stretch>
+                  </pic:blipFill>
+                  <pic:spPr>
+                    <a:xfrm>
+                      <a:off x="0" y="0"/>
+                      <a:ext cx="5943600" cy="1603375"/>
+                    </a:xfrm>
+                    <a:prstGeom prst="rect">
+                      <a:avLst/>
+                    </a:prstGeom>
+                  </pic:spPr>
+                </pic:pic>
+              </a:graphicData>
+            </a:graphic>
+          </wp:inline>
+        </w:drawing>
+      </w:r>
+    </w:p>
+    <w:p>
+      <w:r>
+        <w:rPr>
+          <w:noProof/>
+        </w:rPr>
         <w:drawing>
           <wp:inline distT="0" distB="0" distL="0" distR="0" wp14:anchorId="2DEE6B83" wp14:editId="3A212730">
             <wp:extent cx="5943600" cy="2804795"/>
@@ -184,7 +480,7 @@
                     <pic:cNvPicPr/>
                   </pic:nvPicPr>
                   <pic:blipFill>
-                    <a:blip r:embed="rId8"/>
+                    <a:blip r:embed="rId12"/>
                     <a:stretch>
                       <a:fillRect/>
                     </a:stretch>

</xml_diff>